<commit_message>
Case Study: verbleibende Widersprueche zu echten anonymisierten Daten beheben
Der Nutzer hat bestaetigt: den drei Szenarien liegen echte anonymisierte
Kundendaten zugrunde. Zwei Stellen im Dokument sagten weiterhin das
Gegenteil.

  Abschnitt ZIEL:
    vorher  ...ohne Hype, ohne echte Kundenreferenz und ohne
            erfundene Projektbehauptungen.
    jetzt   ...auf Basis anonymisierter Kundenprojekte, ohne Hype und
            ohne erfundene Zahlen.

  Callout-Label vor der Loesungsbeschreibung in allen drei Szenarien:
    BEISPIEL (3x) -> UMSETZUNG
    'Beispiel' behauptete eine hypothetische Illustration; 'Umsetzung'
    beschreibt die tatsaechlich implementierte Loesung des jeweiligen
    realen Falls.

Keine Zahl geaendert - nur die Einordnung, die dem jetzt bestaetigten
Sachverhalt widersprach. Zip-Struktur und XML nach der Aenderung
geprueft, keine widersspruechlichen Marker (ohne echte
Kundenreferenz/BEISPIEL/modellhaft/beispielhaft) mehr im Dokument.
</commit_message>
<xml_diff>
--- a/Dokumente_lead/final/case_studies/CASE_STUDY_KI_AUTOMATISIERUNG_NUROVELLE_FINAL.docx
+++ b/Dokumente_lead/final/case_studies/CASE_STUDY_KI_AUTOMATISIERUNG_NUROVELLE_FINAL.docx
@@ -422,7 +422,7 @@
               <w:rPr>
                 <w:sz w:val="20"/>
               </w:rPr>
-              <w:t>Die Case Study soll zeigen, wie typische Automatisierungsszenarien wirtschaftlich bewertet werden können - ohne Hype, ohne echte Kundenreferenz und ohne erfundene Projektbehauptungen.</w:t>
+              <w:t>Die Case Study soll zeigen, wie typische Automatisierungsszenarien wirtschaftlich bewertet werden können - auf Basis anonymisierter Kundenprojekte, ohne Hype und ohne erfundene Zahlen.</w:t>
             </w:r>
           </w:p>
         </w:tc>
@@ -918,7 +918,7 @@
                 <w:color w:val="8A5A12"/>
                 <w:sz w:val="20"/>
               </w:rPr>
-              <w:t>BEISPIEL</w:t>
+              <w:t>UMSETZUNG</w:t>
             </w:r>
           </w:p>
           <w:p>
@@ -2164,7 +2164,7 @@
                 <w:color w:val="8A5A12"/>
                 <w:sz w:val="20"/>
               </w:rPr>
-              <w:t>BEISPIEL</w:t>
+              <w:t>UMSETZUNG</w:t>
             </w:r>
           </w:p>
           <w:p>
@@ -3473,7 +3473,7 @@
                 <w:color w:val="8A5A12"/>
                 <w:sz w:val="20"/>
               </w:rPr>
-              <w:t>BEISPIEL</w:t>
+              <w:t>UMSETZUNG</w:t>
             </w:r>
           </w:p>
           <w:p>

</xml_diff>